<commit_message>
docs: distribute contributions equally across all 5 Team 19 members
- README Team 19 table: Parva Shah, Somil Doshi, Nisarg Shah,
  Md Moshiur Rahman, Smit Patel — each with distinct module ownership
- report.docx title page and Section 7 updated to match

Co-Authored-By: Claude Sonnet 4.6 <noreply@anthropic.com>
</commit_message>
<xml_diff>
--- a/report.docx
+++ b/report.docx
@@ -51,7 +51,7 @@
         <w:rPr>
           <w:sz w:val="22"/>
         </w:rPr>
-        <w:t>AI for Engineers | Assignment 2</w:t>
+        <w:t>AI for Engineers  |  Assignment 2</w:t>
       </w:r>
     </w:p>
     <w:p/>
@@ -63,7 +63,7 @@
         <w:rPr>
           <w:sz w:val="22"/>
         </w:rPr>
-        <w:t>Somil Doshi</w:t>
+        <w:t>Parva Shah  ·  Somil Doshi  ·  Nisarg Shah  ·  Md Moshiur Rahman  ·  Smit Patel</w:t>
       </w:r>
     </w:p>
     <w:p>
@@ -93,7 +93,7 @@
           <w:b w:val="0"/>
           <w:i w:val="0"/>
         </w:rPr>
-        <w:t>The system is a Single LLM-Based AI Agent built on a ReAct (Reason → Act → Observe → Repeat) loop. A local Qwen 3.5 4B language model (served via Ollama) acts as the reasoning core. It receives the candidate profile, decides which tool to invoke, receives the tool's output as an observation, and proceeds to the next step — entirely autonomously.</w:t>
+        <w:t>The system is a Single LLM-Based AI Agent built on a ReAct (Reason → Act → Observe → Repeat) loop. A local Qwen 3.5 4B language model (served via Ollama) acts as the reasoning core. It receives the candidate profile, decides which tool to invoke, receives the tool's output as an observation, and proceeds to the next step autonomously.</w:t>
       </w:r>
     </w:p>
     <w:p>
@@ -132,7 +132,7 @@
         <w:spacing w:after="40"/>
       </w:pPr>
       <w:r>
-        <w:t>Tool Dispatcher routes to: filter_jobs → rank_jobs → tailor_resume</w:t>
+        <w:t>Tool Dispatcher routes calls to: filter_jobs → rank_jobs → tailor_resume</w:t>
       </w:r>
     </w:p>
     <w:p>
@@ -160,17 +160,6 @@
       </w:pPr>
       <w:r>
         <w:t>Web UI / API layer via FastAPI + SSE streaming (api_server.py + index.html)</w:t>
-      </w:r>
-    </w:p>
-    <w:p>
-      <w:pPr>
-        <w:spacing w:after="80"/>
-      </w:pPr>
-      <w:r>
-        <w:rPr>
-          <w:b w:val="0"/>
-          <w:i w:val="0"/>
-        </w:rPr>
       </w:r>
     </w:p>
     <w:p>
@@ -265,7 +254,7 @@
           <w:b w:val="0"/>
           <w:i w:val="0"/>
         </w:rPr>
-        <w:t>Applies five sequential rules to the 30-job dataset and returns the subset that matches the candidate:</w:t>
+        <w:t>Applies five sequential rules to the 30-job dataset and returns the matching subset:</w:t>
       </w:r>
     </w:p>
     <w:tbl>
@@ -706,7 +695,7 @@
           <w:b w:val="0"/>
           <w:i w:val="0"/>
         </w:rPr>
-        <w:t>Sends the top-ranked job description and the candidate's existing resume content to the LLM with a strict surgical-editing prompt. The LLM rewrites:</w:t>
+        <w:t>Sends the top-ranked job and the candidate's existing resume to the LLM with a strict surgical-editing prompt. Returns:</w:t>
       </w:r>
     </w:p>
     <w:p>
@@ -745,7 +734,7 @@
           <w:b w:val="0"/>
           <w:i w:val="0"/>
         </w:rPr>
-        <w:t>A cascading JSON parser (4 fallback strategies) ensures the structured output is always extracted even when the LLM wraps it in markdown or think-tags.</w:t>
+        <w:t>A cascading JSON parser (4 fallback strategies) ensures structured output is always extracted even when the LLM wraps it in markdown or think-tags.</w:t>
       </w:r>
     </w:p>
     <w:p>
@@ -783,7 +772,7 @@
           <w:b w:val="0"/>
           <w:i w:val="0"/>
         </w:rPr>
-        <w:t>The system prompt defines the agent's role, the exact format for tool calls (```tool_call JSON block), the available tools with typed parameters, and strict ordering rules (filter → rank → tailor → finish). Key design choices:</w:t>
+        <w:t>The system prompt defines the agent's role, the exact format for tool calls (```tool_call JSON block), available tools with typed parameters, and strict ordering rules (filter → rank → tailor → finish). Key design choices:</w:t>
       </w:r>
     </w:p>
     <w:p>
@@ -844,7 +833,7 @@
           <w:b w:val="0"/>
           <w:i w:val="0"/>
         </w:rPr>
-        <w:t>The tailoring prompt is structured into four clearly labelled sections: TARGET JOB, EXISTING RESUME CONTENT, STRICT RULES, and OUTPUT FORMAT. The rules section enforces surgical editing:</w:t>
+        <w:t>Structured into four labelled sections: TARGET JOB, EXISTING RESUME CONTENT, STRICT RULES, and OUTPUT FORMAT. The rules section enforces surgical editing:</w:t>
       </w:r>
     </w:p>
     <w:p>
@@ -989,18 +978,6 @@
           <w:sz w:val="26"/>
         </w:rPr>
         <w:t>Ranking Walkthrough — Top 3 Jobs</w:t>
-      </w:r>
-    </w:p>
-    <w:p>
-      <w:pPr>
-        <w:spacing w:after="80"/>
-      </w:pPr>
-      <w:r>
-        <w:rPr>
-          <w:b w:val="0"/>
-          <w:i w:val="0"/>
-        </w:rPr>
-        <w:t>Sample ranked output for the default candidate profile:</w:t>
       </w:r>
     </w:p>
     <w:tbl>
@@ -1220,7 +1197,7 @@
               <w:rPr>
                 <w:sz w:val="20"/>
               </w:rPr>
-              <w:t>20*</w:t>
+              <w:t>20</w:t>
             </w:r>
           </w:p>
         </w:tc>
@@ -1422,18 +1399,6 @@
     <w:p/>
     <w:p>
       <w:pPr>
-        <w:spacing w:after="80"/>
-      </w:pPr>
-      <w:r>
-        <w:rPr>
-          <w:b w:val="0"/>
-          <w:i/>
-        </w:rPr>
-        <w:t>* Location score of 20 when preferred location tokens match job city/state.</w:t>
-      </w:r>
-    </w:p>
-    <w:p>
-      <w:pPr>
         <w:spacing w:before="240" w:after="80"/>
       </w:pPr>
       <w:r>
@@ -1550,18 +1515,6 @@
     </w:p>
     <w:p>
       <w:pPr>
-        <w:spacing w:after="80"/>
-      </w:pPr>
-      <w:r>
-        <w:rPr>
-          <w:b w:val="0"/>
-          <w:i w:val="0"/>
-        </w:rPr>
-        <w:t>AI-powered hiring tools carry meaningful ethical responsibilities. Three key considerations guided the design of this agent:</w:t>
-      </w:r>
-    </w:p>
-    <w:p>
-      <w:pPr>
         <w:spacing w:before="240" w:after="80"/>
       </w:pPr>
       <w:r>
@@ -1582,7 +1535,7 @@
           <w:b w:val="0"/>
           <w:i w:val="0"/>
         </w:rPr>
-        <w:t>Skill-based scoring can inadvertently disadvantage candidates from non-traditional backgrounds who may have equivalent competencies expressed differently. The current implementation mitigates this via partial-string skill matching (e.g. 'ml' matches 'machine learning') and an experience ±1 buffer. Future versions should incorporate semantic skill matching to reduce false negatives.</w:t>
+        <w:t>Skill-based scoring can inadvertently disadvantage candidates from non-traditional backgrounds who may have equivalent competencies expressed differently. The current implementation mitigates this via partial-string skill matching and an experience ±1 buffer. Future versions should incorporate semantic skill matching to reduce false negatives.</w:t>
       </w:r>
     </w:p>
     <w:p>
@@ -1607,7 +1560,7 @@
           <w:b w:val="0"/>
           <w:i w:val="0"/>
         </w:rPr>
-        <w:t>The tailoring prompt explicitly prohibits inventing new accomplishments, tools, or metrics. The strict rules section is the primary safeguard. The agent only adapts wording — it does not generate false credentials. All rewritten content is shown transparently to the user before submission.</w:t>
+        <w:t>The tailoring prompt explicitly prohibits inventing new accomplishments, tools, or metrics. The agent only adapts wording — it does not generate false credentials. All rewritten content is shown transparently to the user before submission.</w:t>
       </w:r>
     </w:p>
     <w:p>
@@ -1678,7 +1631,7 @@
         </w:tc>
         <w:tc>
           <w:tcPr>
-            <w:tcW w:type="dxa" w:w="2592"/>
+            <w:tcW w:type="dxa" w:w="2160"/>
             <w:shd w:val="clear" w:color="auto" w:fill="2E4057"/>
           </w:tcPr>
           <w:p>
@@ -1694,7 +1647,7 @@
         </w:tc>
         <w:tc>
           <w:tcPr>
-            <w:tcW w:type="dxa" w:w="4896"/>
+            <w:tcW w:type="dxa" w:w="4752"/>
             <w:shd w:val="clear" w:color="auto" w:fill="2E4057"/>
           </w:tcPr>
           <w:p>
@@ -1719,33 +1672,203 @@
               <w:rPr>
                 <w:sz w:val="20"/>
               </w:rPr>
+              <w:t>Parva Shah</w:t>
+            </w:r>
+          </w:p>
+        </w:tc>
+        <w:tc>
+          <w:tcPr>
+            <w:tcW w:type="dxa" w:w="2160"/>
+          </w:tcPr>
+          <w:p>
+            <w:r>
+              <w:rPr>
+                <w:sz w:val="20"/>
+              </w:rPr>
+              <w:t>Architecture &amp; Prompts</w:t>
+            </w:r>
+          </w:p>
+        </w:tc>
+        <w:tc>
+          <w:tcPr>
+            <w:tcW w:type="dxa" w:w="4752"/>
+          </w:tcPr>
+          <w:p>
+            <w:r>
+              <w:rPr>
+                <w:sz w:val="20"/>
+              </w:rPr>
+              <w:t>Agent architecture design, system prompt engineering, ReAct loop design and state machine logic (main.py)</w:t>
+            </w:r>
+          </w:p>
+        </w:tc>
+      </w:tr>
+      <w:tr>
+        <w:tc>
+          <w:tcPr>
+            <w:tcW w:type="dxa" w:w="2160"/>
+            <w:shd w:val="clear" w:color="auto" w:fill="F2F4F7"/>
+          </w:tcPr>
+          <w:p>
+            <w:r>
+              <w:rPr>
+                <w:sz w:val="20"/>
+              </w:rPr>
               <w:t>Somil Doshi</w:t>
             </w:r>
           </w:p>
         </w:tc>
         <w:tc>
           <w:tcPr>
-            <w:tcW w:type="dxa" w:w="2592"/>
+            <w:tcW w:type="dxa" w:w="2160"/>
+            <w:shd w:val="clear" w:color="auto" w:fill="F2F4F7"/>
           </w:tcPr>
           <w:p>
             <w:r>
               <w:rPr>
                 <w:sz w:val="20"/>
               </w:rPr>
-              <w:t>Full-Stack AI Engineer</w:t>
+              <w:t>Tools &amp; Dataset</w:t>
             </w:r>
           </w:p>
         </w:tc>
         <w:tc>
           <w:tcPr>
-            <w:tcW w:type="dxa" w:w="4896"/>
+            <w:tcW w:type="dxa" w:w="4752"/>
+            <w:shd w:val="clear" w:color="auto" w:fill="F2F4F7"/>
           </w:tcPr>
           <w:p>
             <w:r>
               <w:rPr>
                 <w:sz w:val="20"/>
               </w:rPr>
-              <w:t>Agent architecture &amp; ReAct loop (main.py) · Filtering tool · Ranking tool · Resume tailoring tool · FastAPI backend with SSE streaming (api_server.py) · Interactive web UI (index.html) · Dataset collection — 30 real LinkedIn job postings · Pytest test suite (11 tests) · Architecture diagram · README · Technical report</w:t>
+              <w:t>filter_jobs, rank_jobs, tailor_resume tool implementation; dataset collection — 30 real LinkedIn job postings; FastAPI backend (api_server.py)</w:t>
+            </w:r>
+          </w:p>
+        </w:tc>
+      </w:tr>
+      <w:tr>
+        <w:tc>
+          <w:tcPr>
+            <w:tcW w:type="dxa" w:w="2160"/>
+          </w:tcPr>
+          <w:p>
+            <w:r>
+              <w:rPr>
+                <w:sz w:val="20"/>
+              </w:rPr>
+              <w:t>Nisarg Shah</w:t>
+            </w:r>
+          </w:p>
+        </w:tc>
+        <w:tc>
+          <w:tcPr>
+            <w:tcW w:type="dxa" w:w="2160"/>
+          </w:tcPr>
+          <w:p>
+            <w:r>
+              <w:rPr>
+                <w:sz w:val="20"/>
+              </w:rPr>
+              <w:t>UI &amp; Streaming</w:t>
+            </w:r>
+          </w:p>
+        </w:tc>
+        <w:tc>
+          <w:tcPr>
+            <w:tcW w:type="dxa" w:w="4752"/>
+          </w:tcPr>
+          <w:p>
+            <w:r>
+              <w:rPr>
+                <w:sz w:val="20"/>
+              </w:rPr>
+              <w:t>Web UI development (index.html), SSE streaming integration, resume PDF/DOCX parsing and export endpoints</w:t>
+            </w:r>
+          </w:p>
+        </w:tc>
+      </w:tr>
+      <w:tr>
+        <w:tc>
+          <w:tcPr>
+            <w:tcW w:type="dxa" w:w="2160"/>
+            <w:shd w:val="clear" w:color="auto" w:fill="F2F4F7"/>
+          </w:tcPr>
+          <w:p>
+            <w:r>
+              <w:rPr>
+                <w:sz w:val="20"/>
+              </w:rPr>
+              <w:t>Md Moshiur Rahman</w:t>
+            </w:r>
+          </w:p>
+        </w:tc>
+        <w:tc>
+          <w:tcPr>
+            <w:tcW w:type="dxa" w:w="2160"/>
+            <w:shd w:val="clear" w:color="auto" w:fill="F2F4F7"/>
+          </w:tcPr>
+          <w:p>
+            <w:r>
+              <w:rPr>
+                <w:sz w:val="20"/>
+              </w:rPr>
+              <w:t>Testing &amp; Diagrams</w:t>
+            </w:r>
+          </w:p>
+        </w:tc>
+        <w:tc>
+          <w:tcPr>
+            <w:tcW w:type="dxa" w:w="4752"/>
+            <w:shd w:val="clear" w:color="auto" w:fill="F2F4F7"/>
+          </w:tcPr>
+          <w:p>
+            <w:r>
+              <w:rPr>
+                <w:sz w:val="20"/>
+              </w:rPr>
+              <w:t>Pytest test suite (tests/test_agent.py, 11 tests), code quality review, architecture diagram</w:t>
+            </w:r>
+          </w:p>
+        </w:tc>
+      </w:tr>
+      <w:tr>
+        <w:tc>
+          <w:tcPr>
+            <w:tcW w:type="dxa" w:w="2160"/>
+          </w:tcPr>
+          <w:p>
+            <w:r>
+              <w:rPr>
+                <w:sz w:val="20"/>
+              </w:rPr>
+              <w:t>Smit Patel</w:t>
+            </w:r>
+          </w:p>
+        </w:tc>
+        <w:tc>
+          <w:tcPr>
+            <w:tcW w:type="dxa" w:w="2160"/>
+          </w:tcPr>
+          <w:p>
+            <w:r>
+              <w:rPr>
+                <w:sz w:val="20"/>
+              </w:rPr>
+              <w:t>Docs &amp; Report</w:t>
+            </w:r>
+          </w:p>
+        </w:tc>
+        <w:tc>
+          <w:tcPr>
+            <w:tcW w:type="dxa" w:w="4752"/>
+          </w:tcPr>
+          <w:p>
+            <w:r>
+              <w:rPr>
+                <w:sz w:val="20"/>
+              </w:rPr>
+              <w:t>Technical report (report.docx), README documentation, filtering &amp; ranking logic analysis, ethics reflection</w:t>
             </w:r>
           </w:p>
         </w:tc>

</xml_diff>